<commit_message>
started update for PWM output
</commit_message>
<xml_diff>
--- a/String_pull_loadcell_effort_sensor/Load-Cell-main/Load Cell/circuit_diagram.docx
+++ b/String_pull_loadcell_effort_sensor/Load-Cell-main/Load Cell/circuit_diagram.docx
@@ -3,6 +3,271 @@
 <w:document xmlns:wpc="http://schemas.microsoft.com/office/word/2010/wordprocessingCanvas" xmlns:cx="http://schemas.microsoft.com/office/drawing/2014/chartex" xmlns:cx1="http://schemas.microsoft.com/office/drawing/2015/9/8/chartex" xmlns:cx2="http://schemas.microsoft.com/office/drawing/2015/10/21/chartex" xmlns:cx3="http://schemas.microsoft.com/office/drawing/2016/5/9/chartex" xmlns:cx4="http://schemas.microsoft.com/office/drawing/2016/5/10/chartex" xmlns:cx5="http://schemas.microsoft.com/office/drawing/2016/5/11/chartex" xmlns:cx6="http://schemas.microsoft.com/office/drawing/2016/5/12/chartex" xmlns:cx7="http://schemas.microsoft.com/office/drawing/2016/5/13/chartex" xmlns:cx8="http://schemas.microsoft.com/office/drawing/2016/5/14/chartex" xmlns:mc="http://schemas.openxmlformats.org/markup-compatibility/2006" xmlns:aink="http://schemas.microsoft.com/office/drawing/2016/ink" xmlns:am3d="http://schemas.microsoft.com/office/drawing/2017/model3d" xmlns:o="urn:schemas-microsoft-com:office:office" xmlns:oel="http://schemas.microsoft.com/office/2019/extlst" xmlns:r="http://schemas.openxmlformats.org/officeDocument/2006/relationships" xmlns:m="http://schemas.openxmlformats.org/officeDocument/2006/math" xmlns:v="urn:schemas-microsoft-com:vml" xmlns:wp14="http://schemas.microsoft.com/office/word/2010/wordprocessingDrawing" xmlns:wp="http://schemas.openxmlformats.org/drawingml/2006/wordprocessingDrawing" xmlns:w10="urn:schemas-microsoft-com:office:word" xmlns:w="http://schemas.openxmlformats.org/wordprocessingml/2006/main" xmlns:w14="http://schemas.microsoft.com/office/word/2010/wordml" xmlns:w15="http://schemas.microsoft.com/office/word/2012/wordml" xmlns:w16cex="http://schemas.microsoft.com/office/word/2018/wordml/cex" xmlns:w16cid="http://schemas.microsoft.com/office/word/2016/wordml/cid" xmlns:w16="http://schemas.microsoft.com/office/word/2018/wordml" xmlns:w16du="http://schemas.microsoft.com/office/word/2023/wordml/word16du" xmlns:w16sdtdh="http://schemas.microsoft.com/office/word/2020/wordml/sdtdatahash" xmlns:w16sdtfl="http://schemas.microsoft.com/office/word/2024/wordml/sdtformatlock" xmlns:w16se="http://schemas.microsoft.com/office/word/2015/wordml/symex" xmlns:wpg="http://schemas.microsoft.com/office/word/2010/wordprocessingGroup" xmlns:wpi="http://schemas.microsoft.com/office/word/2010/wordprocessingInk" xmlns:wne="http://schemas.microsoft.com/office/word/2006/wordml" xmlns:wps="http://schemas.microsoft.com/office/word/2010/wordprocessingShape" mc:Ignorable="w14 w15 w16se w16cid w16 w16cex w16sdtdh w16sdtfl w16du wp14">
   <w:body>
     <w:p>
+      <w:r>
+        <w:rPr>
+          <w:noProof/>
+        </w:rPr>
+        <mc:AlternateContent>
+          <mc:Choice Requires="wps">
+            <w:drawing>
+              <wp:anchor distT="45720" distB="45720" distL="114300" distR="114300" simplePos="0" relativeHeight="251688960" behindDoc="0" locked="0" layoutInCell="1" allowOverlap="1" wp14:anchorId="086771DC" wp14:editId="5457E377">
+                <wp:simplePos x="0" y="0"/>
+                <wp:positionH relativeFrom="column">
+                  <wp:posOffset>1185863</wp:posOffset>
+                </wp:positionH>
+                <wp:positionV relativeFrom="paragraph">
+                  <wp:posOffset>5140325</wp:posOffset>
+                </wp:positionV>
+                <wp:extent cx="1499870" cy="771525"/>
+                <wp:effectExtent l="0" t="0" r="24130" b="28575"/>
+                <wp:wrapSquare wrapText="bothSides"/>
+                <wp:docPr id="217" name="Text Box 2"/>
+                <wp:cNvGraphicFramePr>
+                  <a:graphicFrameLocks xmlns:a="http://schemas.openxmlformats.org/drawingml/2006/main"/>
+                </wp:cNvGraphicFramePr>
+                <a:graphic xmlns:a="http://schemas.openxmlformats.org/drawingml/2006/main">
+                  <a:graphicData uri="http://schemas.microsoft.com/office/word/2010/wordprocessingShape">
+                    <wps:wsp>
+                      <wps:cNvSpPr txBox="1">
+                        <a:spLocks noChangeArrowheads="1"/>
+                      </wps:cNvSpPr>
+                      <wps:spPr bwMode="auto">
+                        <a:xfrm>
+                          <a:off x="0" y="0"/>
+                          <a:ext cx="1499870" cy="771525"/>
+                        </a:xfrm>
+                        <a:prstGeom prst="rect">
+                          <a:avLst/>
+                        </a:prstGeom>
+                        <a:solidFill>
+                          <a:srgbClr val="FFFFFF"/>
+                        </a:solidFill>
+                        <a:ln w="9525">
+                          <a:solidFill>
+                            <a:srgbClr val="000000"/>
+                          </a:solidFill>
+                          <a:miter lim="800000"/>
+                          <a:headEnd/>
+                          <a:tailEnd/>
+                        </a:ln>
+                      </wps:spPr>
+                      <wps:txbx>
+                        <w:txbxContent>
+                          <w:p>
+                            <w:r>
+                              <w:t>GND pin 13</w:t>
+                            </w:r>
+                          </w:p>
+                          <w:p>
+                            <w:r>
+                              <w:t>Yellow – PWM sig pin 12, GP9</w:t>
+                            </w:r>
+                          </w:p>
+                          <w:p/>
+                        </w:txbxContent>
+                      </wps:txbx>
+                      <wps:bodyPr rot="0" vert="horz" wrap="square" lIns="91440" tIns="45720" rIns="91440" bIns="45720" anchor="t" anchorCtr="0">
+                        <a:noAutofit/>
+                      </wps:bodyPr>
+                    </wps:wsp>
+                  </a:graphicData>
+                </a:graphic>
+                <wp14:sizeRelH relativeFrom="margin">
+                  <wp14:pctWidth>0</wp14:pctWidth>
+                </wp14:sizeRelH>
+                <wp14:sizeRelV relativeFrom="margin">
+                  <wp14:pctHeight>0</wp14:pctHeight>
+                </wp14:sizeRelV>
+              </wp:anchor>
+            </w:drawing>
+          </mc:Choice>
+          <mc:Fallback>
+            <w:pict>
+              <v:shapetype w14:anchorId="086771DC" id="_x0000_t202" coordsize="21600,21600" o:spt="202" path="m,l,21600r21600,l21600,xe">
+                <v:stroke joinstyle="miter"/>
+                <v:path gradientshapeok="t" o:connecttype="rect"/>
+              </v:shapetype>
+              <v:shape id="Text Box 2" o:spid="_x0000_s1026" type="#_x0000_t202" style="position:absolute;margin-left:93.4pt;margin-top:404.75pt;width:118.1pt;height:60.75pt;z-index:251688960;visibility:visible;mso-wrap-style:square;mso-width-percent:0;mso-height-percent:0;mso-wrap-distance-left:9pt;mso-wrap-distance-top:3.6pt;mso-wrap-distance-right:9pt;mso-wrap-distance-bottom:3.6pt;mso-position-horizontal:absolute;mso-position-horizontal-relative:text;mso-position-vertical:absolute;mso-position-vertical-relative:text;mso-width-percent:0;mso-height-percent:0;mso-width-relative:margin;mso-height-relative:margin;v-text-anchor:top" o:gfxdata="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">
+                <v:textbox>
+                  <w:txbxContent>
+                    <w:p>
+                      <w:r>
+                        <w:t>GND pin 13</w:t>
+                      </w:r>
+                    </w:p>
+                    <w:p>
+                      <w:r>
+                        <w:t>Yellow – PWM sig pin 12, GP9</w:t>
+                      </w:r>
+                    </w:p>
+                    <w:p/>
+                  </w:txbxContent>
+                </v:textbox>
+                <w10:wrap type="square"/>
+              </v:shape>
+            </w:pict>
+          </mc:Fallback>
+        </mc:AlternateContent>
+      </w:r>
+      <w:r>
+        <w:rPr>
+          <w:noProof/>
+        </w:rPr>
+        <mc:AlternateContent>
+          <mc:Choice Requires="wps">
+            <w:drawing>
+              <wp:anchor distT="0" distB="0" distL="114300" distR="114300" simplePos="0" relativeHeight="251686912" behindDoc="0" locked="0" layoutInCell="1" allowOverlap="1" wp14:anchorId="72BADFE4" wp14:editId="2D64D543">
+                <wp:simplePos x="0" y="0"/>
+                <wp:positionH relativeFrom="column">
+                  <wp:posOffset>5614988</wp:posOffset>
+                </wp:positionH>
+                <wp:positionV relativeFrom="paragraph">
+                  <wp:posOffset>-604837</wp:posOffset>
+                </wp:positionV>
+                <wp:extent cx="638175" cy="2905125"/>
+                <wp:effectExtent l="38100" t="19050" r="9525" b="28575"/>
+                <wp:wrapNone/>
+                <wp:docPr id="368650827" name="Connector: Elbow 23"/>
+                <wp:cNvGraphicFramePr/>
+                <a:graphic xmlns:a="http://schemas.openxmlformats.org/drawingml/2006/main">
+                  <a:graphicData uri="http://schemas.microsoft.com/office/word/2010/wordprocessingShape">
+                    <wps:wsp>
+                      <wps:cNvCnPr/>
+                      <wps:spPr>
+                        <a:xfrm flipV="1">
+                          <a:off x="0" y="0"/>
+                          <a:ext cx="638175" cy="2905125"/>
+                        </a:xfrm>
+                        <a:prstGeom prst="bentConnector3">
+                          <a:avLst>
+                            <a:gd name="adj1" fmla="val -31"/>
+                          </a:avLst>
+                        </a:prstGeom>
+                        <a:ln w="38100">
+                          <a:solidFill>
+                            <a:srgbClr val="FFC000"/>
+                          </a:solidFill>
+                        </a:ln>
+                      </wps:spPr>
+                      <wps:style>
+                        <a:lnRef idx="3">
+                          <a:schemeClr val="accent2"/>
+                        </a:lnRef>
+                        <a:fillRef idx="0">
+                          <a:schemeClr val="accent2"/>
+                        </a:fillRef>
+                        <a:effectRef idx="2">
+                          <a:schemeClr val="accent2"/>
+                        </a:effectRef>
+                        <a:fontRef idx="minor">
+                          <a:schemeClr val="tx1"/>
+                        </a:fontRef>
+                      </wps:style>
+                      <wps:bodyPr/>
+                    </wps:wsp>
+                  </a:graphicData>
+                </a:graphic>
+                <wp14:sizeRelH relativeFrom="margin">
+                  <wp14:pctWidth>0</wp14:pctWidth>
+                </wp14:sizeRelH>
+                <wp14:sizeRelV relativeFrom="margin">
+                  <wp14:pctHeight>0</wp14:pctHeight>
+                </wp14:sizeRelV>
+              </wp:anchor>
+            </w:drawing>
+          </mc:Choice>
+          <mc:Fallback>
+            <w:pict>
+              <v:shapetype w14:anchorId="3D0617D5" id="_x0000_t34" coordsize="21600,21600" o:spt="34" o:oned="t" adj="10800" path="m,l@0,0@0,21600,21600,21600e" filled="f">
+                <v:stroke joinstyle="miter"/>
+                <v:formulas>
+                  <v:f eqn="val #0"/>
+                </v:formulas>
+                <v:path arrowok="t" fillok="f" o:connecttype="none"/>
+                <v:handles>
+                  <v:h position="#0,center"/>
+                </v:handles>
+                <o:lock v:ext="edit" shapetype="t"/>
+              </v:shapetype>
+              <v:shape id="Connector: Elbow 23" o:spid="_x0000_s1026" type="#_x0000_t34" style="position:absolute;margin-left:442.15pt;margin-top:-47.6pt;width:50.25pt;height:228.75pt;flip:y;z-index:251686912;visibility:visible;mso-wrap-style:square;mso-width-percent:0;mso-height-percent:0;mso-wrap-distance-left:9pt;mso-wrap-distance-top:0;mso-wrap-distance-right:9pt;mso-wrap-distance-bottom:0;mso-position-horizontal:absolute;mso-position-horizontal-relative:text;mso-position-vertical:absolute;mso-position-vertical-relative:text;mso-width-percent:0;mso-height-percent:0;mso-width-relative:margin;mso-height-relative:margin" o:gfxdata="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" adj="-7" strokecolor="#ffc000" strokeweight="3pt"/>
+            </w:pict>
+          </mc:Fallback>
+        </mc:AlternateContent>
+      </w:r>
+      <w:r>
+        <w:rPr>
+          <w:noProof/>
+        </w:rPr>
+        <mc:AlternateContent>
+          <mc:Choice Requires="wps">
+            <w:drawing>
+              <wp:anchor distT="0" distB="0" distL="114300" distR="114300" simplePos="0" relativeHeight="251684864" behindDoc="0" locked="0" layoutInCell="1" allowOverlap="1" wp14:anchorId="66502764" wp14:editId="60301EFA">
+                <wp:simplePos x="0" y="0"/>
+                <wp:positionH relativeFrom="column">
+                  <wp:posOffset>5405438</wp:posOffset>
+                </wp:positionH>
+                <wp:positionV relativeFrom="paragraph">
+                  <wp:posOffset>-442911</wp:posOffset>
+                </wp:positionV>
+                <wp:extent cx="600075" cy="2705100"/>
+                <wp:effectExtent l="38100" t="19050" r="9525" b="19050"/>
+                <wp:wrapNone/>
+                <wp:docPr id="1520746059" name="Connector: Elbow 23"/>
+                <wp:cNvGraphicFramePr/>
+                <a:graphic xmlns:a="http://schemas.openxmlformats.org/drawingml/2006/main">
+                  <a:graphicData uri="http://schemas.microsoft.com/office/word/2010/wordprocessingShape">
+                    <wps:wsp>
+                      <wps:cNvCnPr/>
+                      <wps:spPr>
+                        <a:xfrm flipV="1">
+                          <a:off x="0" y="0"/>
+                          <a:ext cx="600075" cy="2705100"/>
+                        </a:xfrm>
+                        <a:prstGeom prst="bentConnector3">
+                          <a:avLst>
+                            <a:gd name="adj1" fmla="val -31"/>
+                          </a:avLst>
+                        </a:prstGeom>
+                        <a:ln w="38100">
+                          <a:solidFill>
+                            <a:schemeClr val="tx1"/>
+                          </a:solidFill>
+                        </a:ln>
+                      </wps:spPr>
+                      <wps:style>
+                        <a:lnRef idx="3">
+                          <a:schemeClr val="accent2"/>
+                        </a:lnRef>
+                        <a:fillRef idx="0">
+                          <a:schemeClr val="accent2"/>
+                        </a:fillRef>
+                        <a:effectRef idx="2">
+                          <a:schemeClr val="accent2"/>
+                        </a:effectRef>
+                        <a:fontRef idx="minor">
+                          <a:schemeClr val="tx1"/>
+                        </a:fontRef>
+                      </wps:style>
+                      <wps:bodyPr/>
+                    </wps:wsp>
+                  </a:graphicData>
+                </a:graphic>
+                <wp14:sizeRelH relativeFrom="margin">
+                  <wp14:pctWidth>0</wp14:pctWidth>
+                </wp14:sizeRelH>
+                <wp14:sizeRelV relativeFrom="margin">
+                  <wp14:pctHeight>0</wp14:pctHeight>
+                </wp14:sizeRelV>
+              </wp:anchor>
+            </w:drawing>
+          </mc:Choice>
+          <mc:Fallback>
+            <w:pict>
+              <v:shape w14:anchorId="205174C0" id="Connector: Elbow 23" o:spid="_x0000_s1026" type="#_x0000_t34" style="position:absolute;margin-left:425.65pt;margin-top:-34.85pt;width:47.25pt;height:213pt;flip:y;z-index:251684864;visibility:visible;mso-wrap-style:square;mso-width-percent:0;mso-height-percent:0;mso-wrap-distance-left:9pt;mso-wrap-distance-top:0;mso-wrap-distance-right:9pt;mso-wrap-distance-bottom:0;mso-position-horizontal:absolute;mso-position-horizontal-relative:text;mso-position-vertical:absolute;mso-position-vertical-relative:text;mso-width-percent:0;mso-height-percent:0;mso-width-relative:margin;mso-height-relative:margin" o:gfxdata="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" adj="-7" strokecolor="black [3213]" strokeweight="3pt"/>
+            </w:pict>
+          </mc:Fallback>
+        </mc:AlternateContent>
+      </w:r>
       <w:r>
         <w:rPr>
           <w:noProof/>
@@ -872,7 +1137,7 @@
           <w:noProof/>
         </w:rPr>
         <w:drawing>
-          <wp:anchor distT="0" distB="0" distL="114300" distR="114300" simplePos="0" relativeHeight="251641856" behindDoc="1" locked="0" layoutInCell="1" allowOverlap="1" wp14:anchorId="6F50BE98" wp14:editId="0DE0D274">
+          <wp:anchor distT="0" distB="0" distL="114300" distR="114300" simplePos="0" relativeHeight="251641856" behindDoc="1" locked="0" layoutInCell="1" allowOverlap="1" wp14:anchorId="6F50BE98" wp14:editId="4DF094A6">
             <wp:simplePos x="0" y="0"/>
             <wp:positionH relativeFrom="margin">
               <wp:posOffset>4693755</wp:posOffset>
@@ -1225,6 +1490,9 @@
         </mc:AlternateContent>
       </w:r>
       <w:r>
+        <w:rPr>
+          <w:noProof/>
+        </w:rPr>
         <w:drawing>
           <wp:anchor distT="0" distB="0" distL="114300" distR="114300" simplePos="0" relativeHeight="251638784" behindDoc="1" locked="0" layoutInCell="1" allowOverlap="1" wp14:anchorId="7A6BA9BC" wp14:editId="5EEF285E">
             <wp:simplePos x="0" y="0"/>
@@ -1678,6 +1946,9 @@
         </w:drawing>
       </w:r>
       <w:r>
+        <w:rPr>
+          <w:noProof/>
+        </w:rPr>
         <w:drawing>
           <wp:anchor distT="0" distB="0" distL="114300" distR="114300" simplePos="0" relativeHeight="251640832" behindDoc="1" locked="0" layoutInCell="1" allowOverlap="1" wp14:anchorId="71C212CB" wp14:editId="68227B4B">
             <wp:simplePos x="0" y="0"/>

</xml_diff>